<commit_message>
Add image placement guidance for analysis and demo
</commit_message>
<xml_diff>
--- a/docs/documento_analisi.docx
+++ b/docs/documento_analisi.docx
@@ -504,6 +504,111 @@
     </w:p>
     <w:p>
       <w:r>
+        <w:t xml:space="preserve">### 4.6 Immagine da inserire nel documento</w:t>
+      </w:r>
+    </w:p>
+    <w:p>
+      <w:r>
+        <w:t xml:space="preserve"/>
+      </w:r>
+    </w:p>
+    <w:p>
+      <w:r>
+        <w:t xml:space="preserve">Inserire subito dopo questa sezione un diagramma architetturale semplice, con quattro blocchi:</w:t>
+      </w:r>
+    </w:p>
+    <w:p>
+      <w:r>
+        <w:t xml:space="preserve"/>
+      </w:r>
+    </w:p>
+    <w:p>
+      <w:r>
+        <w:t xml:space="preserve">- client / Swagger UI</w:t>
+      </w:r>
+    </w:p>
+    <w:p>
+      <w:r>
+        <w:t xml:space="preserve">- backend FastAPI</w:t>
+      </w:r>
+    </w:p>
+    <w:p>
+      <w:r>
+        <w:t xml:space="preserve">- MongoDB</w:t>
+      </w:r>
+    </w:p>
+    <w:p>
+      <w:r>
+        <w:t xml:space="preserve">- Apache Solr</w:t>
+      </w:r>
+    </w:p>
+    <w:p>
+      <w:r>
+        <w:t xml:space="preserve">- servizio LLM esterno</w:t>
+      </w:r>
+    </w:p>
+    <w:p>
+      <w:r>
+        <w:t xml:space="preserve"/>
+      </w:r>
+    </w:p>
+    <w:p>
+      <w:r>
+        <w:t xml:space="preserve">Collegamenti da mostrare:</w:t>
+      </w:r>
+    </w:p>
+    <w:p>
+      <w:r>
+        <w:t xml:space="preserve"/>
+      </w:r>
+    </w:p>
+    <w:p>
+      <w:r>
+        <w:t xml:space="preserve">- il client invia richieste HTTP al backend;</w:t>
+      </w:r>
+    </w:p>
+    <w:p>
+      <w:r>
+        <w:t xml:space="preserve">- il backend salva metadati e testo su MongoDB;</w:t>
+      </w:r>
+    </w:p>
+    <w:p>
+      <w:r>
+        <w:t xml:space="preserve">- il backend indicizza e cerca in Solr;</w:t>
+      </w:r>
+    </w:p>
+    <w:p>
+      <w:r>
+        <w:t xml:space="preserve">- il backend invia il testo al modello LLM per la classificazione AI.</w:t>
+      </w:r>
+    </w:p>
+    <w:p>
+      <w:r>
+        <w:t xml:space="preserve"/>
+      </w:r>
+    </w:p>
+    <w:p>
+      <w:r>
+        <w:t xml:space="preserve">Didascalia consigliata:</w:t>
+      </w:r>
+    </w:p>
+    <w:p>
+      <w:r>
+        <w:t xml:space="preserve"/>
+      </w:r>
+    </w:p>
+    <w:p>
+      <w:r>
+        <w:t xml:space="preserve">`Figura 1 - Architettura logica del sistema documentale`</w:t>
+      </w:r>
+    </w:p>
+    <w:p>
+      <w:r>
+        <w:t xml:space="preserve"/>
+      </w:r>
+    </w:p>
+    <w:p>
+      <w:r>
         <w:t xml:space="preserve">## 5. Modello dati</w:t>
       </w:r>
     </w:p>
@@ -774,6 +879,71 @@
     </w:p>
     <w:p>
       <w:r>
+        <w:t xml:space="preserve">### 5.5 Immagine da inserire nel documento</w:t>
+      </w:r>
+    </w:p>
+    <w:p>
+      <w:r>
+        <w:t xml:space="preserve"/>
+      </w:r>
+    </w:p>
+    <w:p>
+      <w:r>
+        <w:t xml:space="preserve">Inserire dopo questa sezione una tabella o screenshot dello schema dati con:</w:t>
+      </w:r>
+    </w:p>
+    <w:p>
+      <w:r>
+        <w:t xml:space="preserve"/>
+      </w:r>
+    </w:p>
+    <w:p>
+      <w:r>
+        <w:t xml:space="preserve">- collection MongoDB `documents`</w:t>
+      </w:r>
+    </w:p>
+    <w:p>
+      <w:r>
+        <w:t xml:space="preserve">- collection `users`</w:t>
+      </w:r>
+    </w:p>
+    <w:p>
+      <w:r>
+        <w:t xml:space="preserve">- collection `audit_log`</w:t>
+      </w:r>
+    </w:p>
+    <w:p>
+      <w:r>
+        <w:t xml:space="preserve">- campi del core Solr `documents`</w:t>
+      </w:r>
+    </w:p>
+    <w:p>
+      <w:r>
+        <w:t xml:space="preserve"/>
+      </w:r>
+    </w:p>
+    <w:p>
+      <w:r>
+        <w:t xml:space="preserve">Didascalia consigliata:</w:t>
+      </w:r>
+    </w:p>
+    <w:p>
+      <w:r>
+        <w:t xml:space="preserve"/>
+      </w:r>
+    </w:p>
+    <w:p>
+      <w:r>
+        <w:t xml:space="preserve">`Figura 2 - Modello dati MongoDB e campi indicizzati su Solr`</w:t>
+      </w:r>
+    </w:p>
+    <w:p>
+      <w:r>
+        <w:t xml:space="preserve"/>
+      </w:r>
+    </w:p>
+    <w:p>
+      <w:r>
         <w:t xml:space="preserve">## 6. Tre proposte di utilizzo dell'AI</w:t>
       </w:r>
     </w:p>
@@ -1159,6 +1329,76 @@
     </w:p>
     <w:p>
       <w:r>
+        <w:t xml:space="preserve">### 6.5 Immagine da inserire nel documento</w:t>
+      </w:r>
+    </w:p>
+    <w:p>
+      <w:r>
+        <w:t xml:space="preserve"/>
+      </w:r>
+    </w:p>
+    <w:p>
+      <w:r>
+        <w:t xml:space="preserve">Inserire qui uno schema del flusso AI implementato:</w:t>
+      </w:r>
+    </w:p>
+    <w:p>
+      <w:r>
+        <w:t xml:space="preserve"/>
+      </w:r>
+    </w:p>
+    <w:p>
+      <w:r>
+        <w:t xml:space="preserve">1. upload file</w:t>
+      </w:r>
+    </w:p>
+    <w:p>
+      <w:r>
+        <w:t xml:space="preserve">2. estrazione testo</w:t>
+      </w:r>
+    </w:p>
+    <w:p>
+      <w:r>
+        <w:t xml:space="preserve">3. invio del testo all'LLM oppure fallback locale</w:t>
+      </w:r>
+    </w:p>
+    <w:p>
+      <w:r>
+        <w:t xml:space="preserve">4. ritorno di `categoria` e `sintesi`</w:t>
+      </w:r>
+    </w:p>
+    <w:p>
+      <w:r>
+        <w:t xml:space="preserve">5. salvataggio in MongoDB e indicizzazione in Solr</w:t>
+      </w:r>
+    </w:p>
+    <w:p>
+      <w:r>
+        <w:t xml:space="preserve"/>
+      </w:r>
+    </w:p>
+    <w:p>
+      <w:r>
+        <w:t xml:space="preserve">Didascalia consigliata:</w:t>
+      </w:r>
+    </w:p>
+    <w:p>
+      <w:r>
+        <w:t xml:space="preserve"/>
+      </w:r>
+    </w:p>
+    <w:p>
+      <w:r>
+        <w:t xml:space="preserve">`Figura 3 - Flusso della classificazione AI del documento`</w:t>
+      </w:r>
+    </w:p>
+    <w:p>
+      <w:r>
+        <w:t xml:space="preserve"/>
+      </w:r>
+    </w:p>
+    <w:p>
+      <w:r>
         <w:t xml:space="preserve">## 7. Requisiti funzionali e copertura</w:t>
       </w:r>
     </w:p>
@@ -1285,6 +1525,46 @@
     <w:p>
       <w:r>
         <w:t xml:space="preserve">Queste scelte evitano il blocco totale del flusso e rendono la demo piu' affidabile.</w:t>
+      </w:r>
+    </w:p>
+    <w:p>
+      <w:r>
+        <w:t xml:space="preserve"/>
+      </w:r>
+    </w:p>
+    <w:p>
+      <w:r>
+        <w:t xml:space="preserve">### 8.1 Immagine da inserire nel documento</w:t>
+      </w:r>
+    </w:p>
+    <w:p>
+      <w:r>
+        <w:t xml:space="preserve"/>
+      </w:r>
+    </w:p>
+    <w:p>
+      <w:r>
+        <w:t xml:space="preserve">Inserire uno screenshot della risposta JSON di `/health` oppure di un errore `503` gestito dal backend, per dimostrare la robustezza applicativa.</w:t>
+      </w:r>
+    </w:p>
+    <w:p>
+      <w:r>
+        <w:t xml:space="preserve"/>
+      </w:r>
+    </w:p>
+    <w:p>
+      <w:r>
+        <w:t xml:space="preserve">Didascalia consigliata:</w:t>
+      </w:r>
+    </w:p>
+    <w:p>
+      <w:r>
+        <w:t xml:space="preserve"/>
+      </w:r>
+    </w:p>
+    <w:p>
+      <w:r>
+        <w:t xml:space="preserve">`Figura 4 - Esempio di gestione controllata degli errori`</w:t>
       </w:r>
     </w:p>
     <w:p>

</xml_diff>

<commit_message>
Finalize document management exercise
</commit_message>
<xml_diff>
--- a/docs/documento_analisi.docx
+++ b/docs/documento_analisi.docx
@@ -1669,27 +1669,132 @@
     </w:p>
     <w:p>
       <w:r>
+        <w:t xml:space="preserve">- test di integrazione live superati;</w:t>
+      </w:r>
+    </w:p>
+    <w:p>
+      <w:r>
+        <w:t xml:space="preserve">- login amministratore funzionante;</w:t>
+      </w:r>
+    </w:p>
+    <w:p>
+      <w:r>
+        <w:t xml:space="preserve">- upload e download documento funzionanti;</w:t>
+      </w:r>
+    </w:p>
+    <w:p>
+      <w:r>
+        <w:t xml:space="preserve">- persistenza MongoDB funzionante;</w:t>
+      </w:r>
+    </w:p>
+    <w:p>
+      <w:r>
         <w:t xml:space="preserve">- indicizzazione e ricerca Solr correttamente funzionanti;</w:t>
       </w:r>
     </w:p>
     <w:p>
       <w:r>
-        <w:t xml:space="preserve">- classificazione AI con fallback funzionante;</w:t>
-      </w:r>
-    </w:p>
-    <w:p>
-      <w:r>
-        <w:t xml:space="preserve">- impossibilita' di completare il flusso di login/upload contro il cluster MongoDB remoto, a causa di un problema di raggiungibilita' infrastrutturale sulla porta `27017`.</w:t>
-      </w:r>
-    </w:p>
-    <w:p>
-      <w:r>
-        <w:t xml:space="preserve"/>
-      </w:r>
-    </w:p>
-    <w:p>
-      <w:r>
-        <w:t xml:space="preserve">Tale ultimo elemento non evidenzia una contraddizione del codice applicativo, ma una dipendenza dall'ambiente di rete e dalla configurazione del provider del database gestito.</w:t>
+        <w:t xml:space="preserve">- classificazione AI con fallback funzionante.</w:t>
+      </w:r>
+    </w:p>
+    <w:p>
+      <w:r>
+        <w:t xml:space="preserve"/>
+      </w:r>
+    </w:p>
+    <w:p>
+      <w:r>
+        <w:t xml:space="preserve">Il collaudo finale e' stato eseguito con MongoDB e Apache Solr avviati tramite Docker locale. L'ambiente verificato utilizza:</w:t>
+      </w:r>
+    </w:p>
+    <w:p>
+      <w:r>
+        <w:t xml:space="preserve"/>
+      </w:r>
+    </w:p>
+    <w:p>
+      <w:r>
+        <w:t xml:space="preserve">- MongoDB su `localhost:27017`;</w:t>
+      </w:r>
+    </w:p>
+    <w:p>
+      <w:r>
+        <w:t xml:space="preserve">- Apache Solr su `localhost:8983`;</w:t>
+      </w:r>
+    </w:p>
+    <w:p>
+      <w:r>
+        <w:t xml:space="preserve">- core Solr dedicato `documents`;</w:t>
+      </w:r>
+    </w:p>
+    <w:p>
+      <w:r>
+        <w:t xml:space="preserve">- backend FastAPI su `http://127.0.0.1:8000`;</w:t>
+      </w:r>
+    </w:p>
+    <w:p>
+      <w:r>
+        <w:t xml:space="preserve">- credenziali demo `admin` / `Admin123!`.</w:t>
+      </w:r>
+    </w:p>
+    <w:p>
+      <w:r>
+        <w:t xml:space="preserve"/>
+      </w:r>
+    </w:p>
+    <w:p>
+      <w:r>
+        <w:t xml:space="preserve">La risposta dell'endpoint `/health` ha confermato il corretto collegamento ai servizi:</w:t>
+      </w:r>
+    </w:p>
+    <w:p>
+      <w:r>
+        <w:t xml:space="preserve"/>
+      </w:r>
+    </w:p>
+    <w:p>
+      <w:r>
+        <w:t xml:space="preserve">```json</w:t>
+      </w:r>
+    </w:p>
+    <w:p>
+      <w:r>
+        <w:t xml:space="preserve">{"app":"ok","mongo":"ok","solr":"ok"}</w:t>
+      </w:r>
+    </w:p>
+    <w:p>
+      <w:r>
+        <w:t xml:space="preserve">```</w:t>
+      </w:r>
+    </w:p>
+    <w:p>
+      <w:r>
+        <w:t xml:space="preserve"/>
+      </w:r>
+    </w:p>
+    <w:p>
+      <w:r>
+        <w:t xml:space="preserve">Sono stati inoltre eseguiti:</w:t>
+      </w:r>
+    </w:p>
+    <w:p>
+      <w:r>
+        <w:t xml:space="preserve"/>
+      </w:r>
+    </w:p>
+    <w:p>
+      <w:r>
+        <w:t xml:space="preserve">- test unitari e di servizio con esito `11 passed`;</w:t>
+      </w:r>
+    </w:p>
+    <w:p>
+      <w:r>
+        <w:t xml:space="preserve">- test di integrazione live con esito `3 passed`;</w:t>
+      </w:r>
+    </w:p>
+    <w:p>
+      <w:r>
+        <w:t xml:space="preserve">- smoke test end-to-end con login, upload, classificazione AI, ricerca e dettaglio documento completati correttamente.</w:t>
       </w:r>
     </w:p>
     <w:p>
@@ -1709,7 +1814,7 @@
     </w:p>
     <w:p>
       <w:r>
-        <w:t xml:space="preserve">Inserire in questa sezione uno screenshot della risposta di `/health` oppure di una risposta `503` gestita dal backend, per documentare il comportamento controllato in condizioni di errore.</w:t>
+        <w:t xml:space="preserve">Inserire in questa sezione uno screenshot della risposta di `/health` con MongoDB e Solr in stato `ok`, oppure uno screenshot dello smoke test end-to-end completato correttamente.</w:t>
       </w:r>
     </w:p>
     <w:p>
@@ -1729,7 +1834,7 @@
     </w:p>
     <w:p>
       <w:r>
-        <w:t xml:space="preserve">`Figura 4 - Esempio di gestione controllata degli errori applicativi`</w:t>
+        <w:t xml:space="preserve">`Figura 4 - Collaudo finale con MongoDB e Solr in Docker`</w:t>
       </w:r>
     </w:p>
     <w:p>

</xml_diff>

<commit_message>
Expand future developments documentation
</commit_message>
<xml_diff>
--- a/docs/documento_analisi.docx
+++ b/docs/documento_analisi.docx
@@ -1879,7 +1879,7 @@
     </w:p>
     <w:p>
       <w:r>
-        <w:t xml:space="preserve">- dipendenza da un'infrastruttura MongoDB esterna per i test completi end-to-end;</w:t>
+        <w:t xml:space="preserve">- necessita' di configurare correttamente i servizi esterni MongoDB e Solr prima della demo;</w:t>
       </w:r>
     </w:p>
     <w:p>
@@ -1914,47 +1914,217 @@
     </w:p>
     <w:p>
       <w:r>
-        <w:t xml:space="preserve">Le principali linee di estensione del sistema possono essere identificate nelle seguenti direttrici:</w:t>
-      </w:r>
-    </w:p>
-    <w:p>
-      <w:r>
-        <w:t xml:space="preserve"/>
-      </w:r>
-    </w:p>
-    <w:p>
-      <w:r>
-        <w:t xml:space="preserve">- integrazione di OCR per documenti scansionati;</w:t>
-      </w:r>
-    </w:p>
-    <w:p>
-      <w:r>
-        <w:t xml:space="preserve">- introduzione di permessi granulari per reparto o livello organizzativo;</w:t>
-      </w:r>
-    </w:p>
-    <w:p>
-      <w:r>
-        <w:t xml:space="preserve">- sviluppo di una interfaccia web dedicata per utenti non tecnici;</w:t>
-      </w:r>
-    </w:p>
-    <w:p>
-      <w:r>
-        <w:t xml:space="preserve">- introduzione della query expansion AI nella fase di ricerca;</w:t>
-      </w:r>
-    </w:p>
-    <w:p>
-      <w:r>
-        <w:t xml:space="preserve">- generazione on demand di riassunti contestuali;</w:t>
-      </w:r>
-    </w:p>
-    <w:p>
-      <w:r>
-        <w:t xml:space="preserve">- dashboard amministrativa per audit e monitoraggio d'uso;</w:t>
-      </w:r>
-    </w:p>
-    <w:p>
-      <w:r>
-        <w:t xml:space="preserve">- gestione del versioning documentale.</w:t>
+        <w:t xml:space="preserve">Le principali linee di estensione del sistema possono essere organizzate per priorita' funzionale. Le proposte seguenti non sono necessarie per soddisfare il perimetro dell'esercitazione, ma rappresentano sviluppi realistici per trasformare il prototipo in un sistema documentale aziendale piu' completo.</w:t>
+      </w:r>
+    </w:p>
+    <w:p>
+      <w:r>
+        <w:t xml:space="preserve"/>
+      </w:r>
+    </w:p>
+    <w:p>
+      <w:r>
+        <w:t xml:space="preserve">### 10.1 OCR per documenti scansionati</w:t>
+      </w:r>
+    </w:p>
+    <w:p>
+      <w:r>
+        <w:t xml:space="preserve"/>
+      </w:r>
+    </w:p>
+    <w:p>
+      <w:r>
+        <w:t xml:space="preserve">L'attuale sistema estrae testo da PDF nativi, DOCX e TXT, ma non esegue OCR su immagini o scansioni. In un contesto aziendale reale molti documenti storici possono essere scansioni prive di testo selezionabile. L'integrazione di un motore OCR, ad esempio Tesseract o un servizio cloud dedicato, permetterebbe di acquisire anche questi documenti e renderli ricercabili in Solr.</w:t>
+      </w:r>
+    </w:p>
+    <w:p>
+      <w:r>
+        <w:t xml:space="preserve"/>
+      </w:r>
+    </w:p>
+    <w:p>
+      <w:r>
+        <w:t xml:space="preserve">Il flusso potrebbe essere esteso in questo modo: se l'estrazione standard da PDF produce poco testo o testo vuoto, il backend attiva una fase OCR sulle pagine del documento, salva il testo ottenuto in MongoDB e lo indicizza normalmente in Solr. Il beneficio principale sarebbe l'aumento della copertura documentale, soprattutto per archivi storici, contratti firmati e documenti ricevuti via scansione.</w:t>
+      </w:r>
+    </w:p>
+    <w:p>
+      <w:r>
+        <w:t xml:space="preserve"/>
+      </w:r>
+    </w:p>
+    <w:p>
+      <w:r>
+        <w:t xml:space="preserve">### 10.2 Permessi granulari e ruoli organizzativi</w:t>
+      </w:r>
+    </w:p>
+    <w:p>
+      <w:r>
+        <w:t xml:space="preserve"/>
+      </w:r>
+    </w:p>
+    <w:p>
+      <w:r>
+        <w:t xml:space="preserve">L'autenticazione attuale e' volutamente semplice: l'utente autenticato puo' usare gli endpoint principali. In una versione aziendale sarebbe opportuno introdurre ruoli e permessi piu' dettagliati, ad esempio admin, ufficio acquisti, amministrazione, risorse umane e utente in sola lettura.</w:t>
+      </w:r>
+    </w:p>
+    <w:p>
+      <w:r>
+        <w:t xml:space="preserve"/>
+      </w:r>
+    </w:p>
+    <w:p>
+      <w:r>
+        <w:t xml:space="preserve">Questa evoluzione richiederebbe nuovi campi sui documenti, come `department`, `visibility` o `allowed_roles`, e controlli autorizzativi negli endpoint di ricerca, dettaglio e download. In questo modo un CV potrebbe essere visibile solo alle risorse umane, mentre fatture e ordini potrebbero essere accessibili all'amministrazione e agli acquisti. Il vantaggio sarebbe un controllo degli accessi piu' coerente con la riservatezza dei documenti aziendali.</w:t>
+      </w:r>
+    </w:p>
+    <w:p>
+      <w:r>
+        <w:t xml:space="preserve"/>
+      </w:r>
+    </w:p>
+    <w:p>
+      <w:r>
+        <w:t xml:space="preserve">### 10.3 Interfaccia web frontend</w:t>
+      </w:r>
+    </w:p>
+    <w:p>
+      <w:r>
+        <w:t xml:space="preserve"/>
+      </w:r>
+    </w:p>
+    <w:p>
+      <w:r>
+        <w:t xml:space="preserve">Il progetto espone gia' una Swagger UI sufficiente per test e demo tecnica, ma un utente aziendale non tecnico avrebbe bisogno di una interfaccia dedicata. Un frontend web potrebbe includere una pagina di login, una schermata di upload con selezione guidata dei metadati, una pagina di ricerca con filtri laterali e una vista dettaglio documento.</w:t>
+      </w:r>
+    </w:p>
+    <w:p>
+      <w:r>
+        <w:t xml:space="preserve"/>
+      </w:r>
+    </w:p>
+    <w:p>
+      <w:r>
+        <w:t xml:space="preserve">La realizzazione potrebbe avvenire con React, Vue o template server-side. Il backend FastAPI rimarrebbe invariato e il frontend consumerebbe gli endpoint gia' disponibili. Il beneficio principale sarebbe rendere il sistema utilizzabile da utenti operativi senza conoscenze tecniche o strumenti come curl e Swagger.</w:t>
+      </w:r>
+    </w:p>
+    <w:p>
+      <w:r>
+        <w:t xml:space="preserve"/>
+      </w:r>
+    </w:p>
+    <w:p>
+      <w:r>
+        <w:t xml:space="preserve">### 10.4 Espansione semantica della ricerca con AI</w:t>
+      </w:r>
+    </w:p>
+    <w:p>
+      <w:r>
+        <w:t xml:space="preserve"/>
+      </w:r>
+    </w:p>
+    <w:p>
+      <w:r>
+        <w:t xml:space="preserve">La query expansion e' una delle proposte AI progettuali gia' descritte. In una futura implementazione, quando l'utente cerca una parola generica o incompleta, il sistema potrebbe usare un modello AI per generare sinonimi, termini correlati o una formulazione piu' adatta a Solr.</w:t>
+      </w:r>
+    </w:p>
+    <w:p>
+      <w:r>
+        <w:t xml:space="preserve"/>
+      </w:r>
+    </w:p>
+    <w:p>
+      <w:r>
+        <w:t xml:space="preserve">Ad esempio, una ricerca come "computer ufficio" potrebbe essere espansa in "materiale informatico", "fornitura hardware", "postazioni di lavoro" e "stampanti". Il backend dovrebbe comunque mantenere un fallback: se il modello non risponde, viene usata la query originale. Questa funzionalita' migliorerebbe la qualita' dei risultati quando il lessico usato dall'utente non coincide con quello presente nei documenti.</w:t>
+      </w:r>
+    </w:p>
+    <w:p>
+      <w:r>
+        <w:t xml:space="preserve"/>
+      </w:r>
+    </w:p>
+    <w:p>
+      <w:r>
+        <w:t xml:space="preserve">### 10.5 Riassunto AI on demand</w:t>
+      </w:r>
+    </w:p>
+    <w:p>
+      <w:r>
+        <w:t xml:space="preserve"/>
+      </w:r>
+    </w:p>
+    <w:p>
+      <w:r>
+        <w:t xml:space="preserve">Il sistema salva gia' una sintesi breve prodotta durante la classificazione AI. Una possibile evoluzione consiste nel generare riassunti piu' dettagliati su richiesta, direttamente dalla pagina di dettaglio del documento.</w:t>
+      </w:r>
+    </w:p>
+    <w:p>
+      <w:r>
+        <w:t xml:space="preserve"/>
+      </w:r>
+    </w:p>
+    <w:p>
+      <w:r>
+        <w:t xml:space="preserve">Il riassunto on demand potrebbe essere utile per contratti lunghi, comunicazioni articolate o documentazione amministrativa. L'utente potrebbe richiedere una sintesi dei punti principali, delle scadenze, delle parti coinvolte o degli importi. Il risultato potrebbe essere mostrato a video e, se utile, salvato in cache per evitare chiamate ripetute al modello. In caso di errore dell'AI, il sistema continuerebbe a mostrare il testo estratto originale.</w:t>
+      </w:r>
+    </w:p>
+    <w:p>
+      <w:r>
+        <w:t xml:space="preserve"/>
+      </w:r>
+    </w:p>
+    <w:p>
+      <w:r>
+        <w:t xml:space="preserve">### 10.6 Dashboard amministrativa e monitoraggio</w:t>
+      </w:r>
+    </w:p>
+    <w:p>
+      <w:r>
+        <w:t xml:space="preserve"/>
+      </w:r>
+    </w:p>
+    <w:p>
+      <w:r>
+        <w:t xml:space="preserve">La collection `audit_log` registra gia' le operazioni principali. Una futura dashboard amministrativa potrebbe trasformare questi dati in indicatori utili: numero di documenti caricati, ricerche piu' frequenti, utenti piu' attivi, errori di indicizzazione, categorie documentali piu' presenti.</w:t>
+      </w:r>
+    </w:p>
+    <w:p>
+      <w:r>
+        <w:t xml:space="preserve"/>
+      </w:r>
+    </w:p>
+    <w:p>
+      <w:r>
+        <w:t xml:space="preserve">Questa evoluzione aiuterebbe l'amministratore a monitorare l'uso del sistema e a individuare problemi operativi. Ad esempio, molte ricerche senza risultati potrebbero indicare la necessita' di migliorare i metadati, aggiungere sinonimi o potenziare la ricerca semantica.</w:t>
+      </w:r>
+    </w:p>
+    <w:p>
+      <w:r>
+        <w:t xml:space="preserve"/>
+      </w:r>
+    </w:p>
+    <w:p>
+      <w:r>
+        <w:t xml:space="preserve">### 10.7 Versioning documentale</w:t>
+      </w:r>
+    </w:p>
+    <w:p>
+      <w:r>
+        <w:t xml:space="preserve"/>
+      </w:r>
+    </w:p>
+    <w:p>
+      <w:r>
+        <w:t xml:space="preserve">Nel sistema attuale ogni upload crea un nuovo documento. In un contesto reale puo' essere necessario gestire versioni successive dello stesso file, ad esempio un contratto aggiornato o una procedura interna revisionata.</w:t>
+      </w:r>
+    </w:p>
+    <w:p>
+      <w:r>
+        <w:t xml:space="preserve"/>
+      </w:r>
+    </w:p>
+    <w:p>
+      <w:r>
+        <w:t xml:space="preserve">Il versioning potrebbe essere implementato aggiungendo un campo `document_group_id`, un numero di versione e uno stato del documento, come `bozza`, `attivo` o `archiviato`. In questo modo sarebbe possibile mantenere lo storico delle modifiche, distinguere la versione corrente da quelle precedenti e ricostruire l'evoluzione del documento nel tempo.</w:t>
       </w:r>
     </w:p>
     <w:p>

</xml_diff>

<commit_message>
Document MongoDB online configuration
</commit_message>
<xml_diff>
--- a/docs/documento_analisi.docx
+++ b/docs/documento_analisi.docx
@@ -1704,7 +1704,17 @@
     </w:p>
     <w:p>
       <w:r>
-        <w:t xml:space="preserve">Il collaudo finale e' stato eseguito con MongoDB e Apache Solr avviati tramite Docker locale. L'ambiente verificato utilizza:</w:t>
+        <w:t xml:space="preserve">Il collaudo finale locale e' stato eseguito con MongoDB e Apache Solr avviati tramite Docker. La stessa applicazione puo' pero' usare anche un MongoDB online, modificando solo le variabili `MONGO_URI` e `MONGO_DB_NAME` nel file `.env`.</w:t>
+      </w:r>
+    </w:p>
+    <w:p>
+      <w:r>
+        <w:t xml:space="preserve"/>
+      </w:r>
+    </w:p>
+    <w:p>
+      <w:r>
+        <w:t xml:space="preserve">L'ambiente locale verificato utilizza:</w:t>
       </w:r>
     </w:p>
     <w:p>
@@ -1744,6 +1754,16 @@
     </w:p>
     <w:p>
       <w:r>
+        <w:t xml:space="preserve">Per la verifica su MongoDB online, il backend non richiede modifiche al codice. E' sufficiente configurare una stringa di connessione remota, ad esempio verso MongoDB Atlas o DigitalOcean Managed MongoDB, e assicurarsi che l'IP della macchina di test sia autorizzato nella allowlist del provider. Alla prima partenza, se il database remoto e' raggiungibile, l'applicazione crea automaticamente l'utente admin predefinito.</w:t>
+      </w:r>
+    </w:p>
+    <w:p>
+      <w:r>
+        <w:t xml:space="preserve"/>
+      </w:r>
+    </w:p>
+    <w:p>
+      <w:r>
         <w:t xml:space="preserve">La risposta dell'endpoint `/health` ha confermato il corretto collegamento ai servizi:</w:t>
       </w:r>
     </w:p>
@@ -1879,7 +1899,7 @@
     </w:p>
     <w:p>
       <w:r>
-        <w:t xml:space="preserve">- necessita' di configurare correttamente i servizi esterni MongoDB e Solr prima della demo;</w:t>
+        <w:t xml:space="preserve">- necessita' di configurare correttamente i servizi esterni MongoDB e Solr prima della demo, in particolare allowlist e credenziali nel caso di MongoDB online;</w:t>
       </w:r>
     </w:p>
     <w:p>

</xml_diff>

<commit_message>
Emphasize AI proposals in delivery documents
</commit_message>
<xml_diff>
--- a/docs/documento_analisi.docx
+++ b/docs/documento_analisi.docx
@@ -1074,6 +1074,16 @@
     </w:p>
     <w:p>
       <w:r>
+        <w:t xml:space="preserve">Questa e' una delle parti centrali dell'analisi, perche' non si limita a dichiarare genericamente l'uso di un modello linguistico, ma descrive tre applicazioni concrete nel flusso operativo del sistema: una sul caricamento, una sulla ricerca e una sulla consultazione.</w:t>
+      </w:r>
+    </w:p>
+    <w:p>
+      <w:r>
+        <w:t xml:space="preserve"/>
+      </w:r>
+    </w:p>
+    <w:p>
+      <w:r>
         <w:t xml:space="preserve">### 6.1 Proposta 1 - Classificazione automatica del documento (implementata)</w:t>
       </w:r>
     </w:p>

</xml_diff>